<commit_message>
Update OCC quarterly aggregation and ratio analysis
</commit_message>
<xml_diff>
--- a/OCC_Ratio_Time_Series_Report_EN.docx
+++ b/OCC_Ratio_Time_Series_Report_EN.docx
@@ -7,7 +7,7 @@
         <w:pStyle w:val="Title"/>
       </w:pPr>
       <w:r>
-        <w:t>OCC Ratio Time Series Analysis</w:t>
+        <w:t>Quarterly OCC Ratio Time Series Analysis</w:t>
       </w:r>
     </w:p>
     <w:p>
@@ -20,7 +20,7 @@
           <w:color w:val="667085"/>
           <w:sz w:val="22"/>
         </w:rPr>
-        <w:t>OCC exposure relative to headcount and total assets | 2011 Q1 to 2025 Q4</w:t>
+        <w:t>Quarterly OCC relative to headcount and total assets | 2011 Q1 to 2025 Q4</w:t>
       </w:r>
     </w:p>
     <w:p>
@@ -28,7 +28,7 @@
         <w:spacing w:after="200"/>
       </w:pPr>
       <w:r>
-        <w:t>This report examines whether OCC exposure shows a persistent trend after scaling it by headcount and total assets. The main result is asymmetric: OCC exposure per employee rises steadily, while OCC exposure as a share of assets does not follow one stable downward trend. The apparent full-sample decline in OCC/assets is largely associated with the 2019 Q1 acquisition or consolidation breakpoint.</w:t>
+        <w:t>This report recalculates OCC as the sum of the three monthly observations in each quarter. The preferred balance-sheet ratio divides that quarterly OCC amount by the arithmetic average of the three monthly asset balances; OCC/headcount uses quarter-end headcount. The main result remains asymmetric: OCC per employee rises strongly, while OCC relative to assets is dominated by a 2019 Q1 level break rather than a stable within-regime decline.</w:t>
       </w:r>
     </w:p>
     <w:p>
@@ -45,7 +45,7 @@
         <w:spacing w:after="60"/>
       </w:pPr>
       <w:r>
-        <w:t>OCC/assets fell from 3.54 basis points in 2011 Q1 to 2.67 basis points in 2025 Q4. A single full-sample trend is −0.067 basis points per year, but the separate pre- and post-2019 slopes are small and statistically weak.</w:t>
+        <w:t>Quarterly OCC / average assets fell from 10.20 basis points in 2011 Q1 to 8.03 basis points in 2025 Q4. The full-sample slope is -0.206 basis points per year, but the pre-2019 slope is near zero and the post-2019 slope is statistically weak.</w:t>
       </w:r>
     </w:p>
     <w:p>
@@ -54,7 +54,7 @@
         <w:spacing w:after="60"/>
       </w:pPr>
       <w:r>
-        <w:t>OCC/headcount rose from 1,892 to 3,387 per employee over the same period, a 79.0% increase. The fitted trend is +122 per employee per year, with R² = 0.940.</w:t>
+        <w:t>Quarterly OCC / headcount rose from 5,564 to 10,222 per employee, an increase of 83.7%. The fitted full-sample trend is +357 per employee per year, with R² = 0.967.</w:t>
       </w:r>
     </w:p>
     <w:p>
@@ -63,7 +63,7 @@
         <w:spacing w:after="60"/>
       </w:pPr>
       <w:r>
-        <w:t>Between 2018 Q4 and 2019 Q1, assets increased 42.7%, OCC exposure increased 23.8%, and headcount increased 15.8%. OCC/assets fell 13.3%, while OCC/headcount rose 6.9%.</w:t>
+        <w:t>Between 2018 Q4 and 2019 Q1, average assets increased 41.9%, quarterly OCC increased only 12.1%, and headcount increased 15.8%. As a result, OCC/assets fell 21.0% and OCC/headcount fell 3.3% at the breakpoint.</w:t>
       </w:r>
     </w:p>
     <w:p>
@@ -72,7 +72,7 @@
         <w:spacing w:after="60"/>
       </w:pPr>
       <w:r>
-        <w:t>The ratio identity explains the divergence: OCC/headcount equals OCC/assets multiplied by assets/headcount. Assets per employee increased 137.2% from 2011 Q1 to 2025 Q4, more than offsetting the 24.5% decline in OCC/assets.</w:t>
+        <w:t>The ratio identity explains the longer-run divergence: average assets per employee increased 133.5% from 2011 Q1 to 2025 Q4, more than offsetting the 21.3% decline in OCC/assets.</w:t>
       </w:r>
     </w:p>
     <w:p>
@@ -81,7 +81,7 @@
         <w:spacing w:after="60"/>
       </w:pPr>
       <w:r>
-        <w:t>Since 2023 Q1, both ratios have generally moved upward. OCC/assets rose at an estimated 0.095 basis points per year and OCC/headcount rose about 180 per employee per year, although both eased during 2025.</w:t>
+        <w:t>Since 2023 Q1, both ratios have generally moved upward. The estimated slopes are +0.328 basis points per year for OCC/assets and +597 per employee per year for OCC/headcount; both series flattened near the end of 2025.</w:t>
       </w:r>
     </w:p>
     <w:p>
@@ -97,7 +97,7 @@
         <w:keepLines w:val="0"/>
       </w:pPr>
       <w:r>
-        <w:t>The analysis uses 60 quarterly observations from 2011 Q1 through 2025 Q4. OCC is treated as an exposure or asset stock. The two primary ratios are defined as follows:</w:t>
+        <w:t>The analysis uses 60 quarterly observations from 2011 Q1 through 2025 Q4. The two primary ratios are defined as follows:</w:t>
       </w:r>
     </w:p>
     <w:p>
@@ -106,7 +106,7 @@
         <w:spacing w:after="60"/>
       </w:pPr>
       <w:r>
-        <w:t>OCC/assets = quarter-end OCC exposure divided by quarter-end total assets, expressed in basis points.</w:t>
+        <w:t>Quarterly OCC/assets = the sum of the three monthly OCC observations divided by the arithmetic average of the three monthly asset balances, expressed in basis points per quarter.</w:t>
       </w:r>
     </w:p>
     <w:p>
@@ -115,7 +115,7 @@
         <w:spacing w:after="60"/>
       </w:pPr>
       <w:r>
-        <w:t>OCC/headcount = quarter-end OCC exposure divided by quarter-end SNV headcount, expressed as exposure per employee.</w:t>
+        <w:t>Quarterly OCC/headcount = the same three-month OCC sum divided by quarter-end SNV headcount, expressed as quarterly OCC per employee.</w:t>
       </w:r>
     </w:p>
     <w:p>
@@ -123,7 +123,15 @@
         <w:keepLines w:val="0"/>
       </w:pPr>
       <w:r>
-        <w:t>Linear trends are estimated separately for the full sample, the period before 2019 Q1, the period from 2019 Q1 onward, and recent subsamples. Reported t-statistics use Newey-West standard errors with four quarterly lags. These regressions summarize direction and stability; they do not establish causality or a forecasting model.</w:t>
+        <w:t>Quarter-end OCC is retained in the workbook only as a reference and is not the numerator used in this report. Quarter-end assets are also shown as a denominator sensitivity. Linear trends are estimated for the full sample, the period before 2019 Q1, the period from 2019 Q1 onward, and the period since 2023 Q1. Reported t-statistics use Newey-West standard errors with four quarterly lags.</w:t>
+      </w:r>
+    </w:p>
+    <w:p>
+      <w:pPr>
+        <w:keepLines w:val="0"/>
+      </w:pPr>
+      <w:r>
+        <w:t>“Slope per year” is the fitted quarterly slope multiplied by four. It is an annualized linear change in the stated ratio units—not a percentage growth rate and not a one-year forecast.</w:t>
       </w:r>
     </w:p>
     <w:p>
@@ -144,7 +152,7 @@
         <w:keepLines w:val="0"/>
       </w:pPr>
       <w:r>
-        <w:t>The full-sample series slopes downward, but the decline is not well described by one continuous linear process. OCC/assets was 3.42 basis points in 2018 Q4 and 2.97 basis points in 2019 Q1. That 0.45 basis point drop accounts for much of the visual separation between the early and later parts of the sample.</w:t>
+        <w:t>The full-sample series slopes downward, but the decline is not well described by one continuous linear process. OCC/average assets was 10.54 basis points in 2018 Q4 and 8.32 basis points in 2019 Q1. That 2.21 basis point drop creates most of the visual separation between the early and later regimes.</w:t>
       </w:r>
     </w:p>
     <w:p>
@@ -155,7 +163,7 @@
         <w:drawing>
           <wp:inline xmlns:a="http://schemas.openxmlformats.org/drawingml/2006/main" xmlns:pic="http://schemas.openxmlformats.org/drawingml/2006/picture">
             <wp:extent cx="6263640" cy="3062224"/>
-            <wp:docPr id="1" name="Picture 1" descr="Quarterly OCC exposure divided by total assets from 2011 Q1 to 2025 Q4, with a marked 2019 Q1 breakpoint and separate pre- and post-break trend lines."/>
+            <wp:docPr id="1" name="Picture 1" descr="Quarterly three-month OCC sum divided by three-month average assets from 2011 Q1 to 2025 Q4, with a marked 2019 Q1 breakpoint and separate pre- and post-break trend lines."/>
             <wp:cNvGraphicFramePr>
               <a:graphicFrameLocks noChangeAspect="1"/>
             </wp:cNvGraphicFramePr>
@@ -197,7 +205,7 @@
           <w:color w:val="667085"/>
           <w:sz w:val="17"/>
         </w:rPr>
-        <w:t>Figure 1  OCC exposure as a share of quarter-end assets</w:t>
+        <w:t>Figure 1  Quarterly OCC as a share of three-month average assets</w:t>
       </w:r>
     </w:p>
     <w:tbl>
@@ -456,7 +464,7 @@
                 <w:color w:val="000000"/>
                 <w:sz w:val="16"/>
               </w:rPr>
-              <w:t>-0.067</w:t>
+              <w:t>-0.206</w:t>
             </w:r>
           </w:p>
         </w:tc>
@@ -489,7 +497,7 @@
                 <w:color w:val="000000"/>
                 <w:sz w:val="16"/>
               </w:rPr>
-              <w:t>0.665</w:t>
+              <w:t>0.721</w:t>
             </w:r>
           </w:p>
         </w:tc>
@@ -522,7 +530,7 @@
                 <w:color w:val="000000"/>
                 <w:sz w:val="16"/>
               </w:rPr>
-              <w:t>-8.42</w:t>
+              <w:t>-8.79</w:t>
             </w:r>
           </w:p>
         </w:tc>
@@ -626,7 +634,7 @@
                 <w:color w:val="000000"/>
                 <w:sz w:val="16"/>
               </w:rPr>
-              <w:t>-0.017</w:t>
+              <w:t>-0.023</w:t>
             </w:r>
           </w:p>
         </w:tc>
@@ -659,7 +667,7 @@
                 <w:color w:val="000000"/>
                 <w:sz w:val="16"/>
               </w:rPr>
-              <w:t>0.050</w:t>
+              <w:t>0.025</w:t>
             </w:r>
           </w:p>
         </w:tc>
@@ -692,7 +700,7 @@
                 <w:color w:val="000000"/>
                 <w:sz w:val="16"/>
               </w:rPr>
-              <w:t>-1.12</w:t>
+              <w:t>-0.57</w:t>
             </w:r>
           </w:p>
         </w:tc>
@@ -725,7 +733,7 @@
                 <w:color w:val="000000"/>
                 <w:sz w:val="16"/>
               </w:rPr>
-              <w:t>Weak negative slope</w:t>
+              <w:t>Essentially flat</w:t>
             </w:r>
           </w:p>
         </w:tc>
@@ -796,7 +804,7 @@
                 <w:color w:val="000000"/>
                 <w:sz w:val="16"/>
               </w:rPr>
-              <w:t>-0.024</w:t>
+              <w:t>-0.078</w:t>
             </w:r>
           </w:p>
         </w:tc>
@@ -829,7 +837,7 @@
                 <w:color w:val="000000"/>
                 <w:sz w:val="16"/>
               </w:rPr>
-              <w:t>0.083</w:t>
+              <w:t>0.129</w:t>
             </w:r>
           </w:p>
         </w:tc>
@@ -862,7 +870,7 @@
                 <w:color w:val="000000"/>
                 <w:sz w:val="16"/>
               </w:rPr>
-              <w:t>-1.10</w:t>
+              <w:t>-1.20</w:t>
             </w:r>
           </w:p>
         </w:tc>
@@ -966,7 +974,7 @@
                 <w:color w:val="000000"/>
                 <w:sz w:val="16"/>
               </w:rPr>
-              <w:t>0.095</w:t>
+              <w:t>0.328</w:t>
             </w:r>
           </w:p>
         </w:tc>
@@ -999,7 +1007,7 @@
                 <w:color w:val="000000"/>
                 <w:sz w:val="16"/>
               </w:rPr>
-              <w:t>0.413</w:t>
+              <w:t>0.647</w:t>
             </w:r>
           </w:p>
         </w:tc>
@@ -1032,7 +1040,7 @@
                 <w:color w:val="000000"/>
                 <w:sz w:val="16"/>
               </w:rPr>
-              <w:t>2.77</w:t>
+              <w:t>4.27</w:t>
             </w:r>
           </w:p>
         </w:tc>
@@ -1065,7 +1073,7 @@
                 <w:color w:val="000000"/>
                 <w:sz w:val="16"/>
               </w:rPr>
-              <w:t>Moderate positive slope</w:t>
+              <w:t>Positive recent slope</w:t>
             </w:r>
           </w:p>
         </w:tc>
@@ -1090,7 +1098,7 @@
         <w:keepLines w:val="0"/>
       </w:pPr>
       <w:r>
-        <w:t>The pre-break slope is −0.017 basis points per year with R² = 0.050, and the post-break slope is −0.024 basis points per year with R² = 0.083. Neither segment supports a strong, stable decline. By contrast, the series rises after its 2023 Q1 low of 2.32 basis points. The recent slope is positive, although the ratio remained below its 2011 level at the end of 2025.</w:t>
+        <w:t>The pre-break slope is -0.023 basis points per year with R² = 0.025; it is economically small and statistically weak. The post-break slope is -0.078 basis points per year with R² = 0.129 and a HAC t-statistic of -1.20. The series then rises from its 2023 Q2 low of 7.01 basis points. This supports a level-break interpretation rather than one stable downward trend.</w:t>
       </w:r>
     </w:p>
     <w:p>
@@ -1111,7 +1119,7 @@
         <w:keepLines w:val="0"/>
       </w:pPr>
       <w:r>
-        <w:t>OCC/headcount has a much clearer trend. The ratio rose before and after the acquisition breakpoint. Its full-sample increase is therefore not an artifact of the 2019 level change, although the breakpoint shifted the series upward.</w:t>
+        <w:t>Quarterly OCC/headcount has a much clearer upward trend. It rose strongly both before and after the acquisition breakpoint. Unlike the earlier quarter-end OCC calculation, the corrected three-month sum shows a small decline at the 2019 Q1 breakpoint itself; the long-run increase comes from persistent growth within each regime.</w:t>
       </w:r>
     </w:p>
     <w:p>
@@ -1122,7 +1130,7 @@
         <w:drawing>
           <wp:inline xmlns:a="http://schemas.openxmlformats.org/drawingml/2006/main" xmlns:pic="http://schemas.openxmlformats.org/drawingml/2006/picture">
             <wp:extent cx="6263640" cy="3062224"/>
-            <wp:docPr id="2" name="Picture 2" descr="Quarterly OCC exposure per employee from 2011 Q1 to 2025 Q4, with a marked 2019 Q1 breakpoint and separate pre- and post-break trend lines."/>
+            <wp:docPr id="2" name="Picture 2" descr="Quarterly three-month OCC sum per quarter-end employee from 2011 Q1 to 2025 Q4, with a marked 2019 Q1 breakpoint and separate pre- and post-break trend lines."/>
             <wp:cNvGraphicFramePr>
               <a:graphicFrameLocks noChangeAspect="1"/>
             </wp:cNvGraphicFramePr>
@@ -1164,7 +1172,7 @@
           <w:color w:val="667085"/>
           <w:sz w:val="17"/>
         </w:rPr>
-        <w:t>Figure 2  OCC exposure per employee</w:t>
+        <w:t>Figure 2  Quarterly OCC per quarter-end employee</w:t>
       </w:r>
     </w:p>
     <w:tbl>
@@ -1423,7 +1431,7 @@
                 <w:color w:val="000000"/>
                 <w:sz w:val="16"/>
               </w:rPr>
-              <w:t>121.556</w:t>
+              <w:t>356.984</w:t>
             </w:r>
           </w:p>
         </w:tc>
@@ -1456,7 +1464,7 @@
                 <w:color w:val="000000"/>
                 <w:sz w:val="16"/>
               </w:rPr>
-              <w:t>0.940</w:t>
+              <w:t>0.967</w:t>
             </w:r>
           </w:p>
         </w:tc>
@@ -1489,7 +1497,7 @@
                 <w:color w:val="000000"/>
                 <w:sz w:val="16"/>
               </w:rPr>
-              <w:t>19.02</w:t>
+              <w:t>20.98</w:t>
             </w:r>
           </w:p>
         </w:tc>
@@ -1593,7 +1601,7 @@
                 <w:color w:val="000000"/>
                 <w:sz w:val="16"/>
               </w:rPr>
-              <w:t>92.978</w:t>
+              <w:t>289.696</w:t>
             </w:r>
           </w:p>
         </w:tc>
@@ -1626,7 +1634,7 @@
                 <w:color w:val="000000"/>
                 <w:sz w:val="16"/>
               </w:rPr>
-              <w:t>0.794</w:t>
+              <w:t>0.922</w:t>
             </w:r>
           </w:p>
         </w:tc>
@@ -1659,7 +1667,7 @@
                 <w:color w:val="000000"/>
                 <w:sz w:val="16"/>
               </w:rPr>
-              <w:t>9.27</w:t>
+              <w:t>10.46</w:t>
             </w:r>
           </w:p>
         </w:tc>
@@ -1763,7 +1771,7 @@
                 <w:color w:val="000000"/>
                 <w:sz w:val="16"/>
               </w:rPr>
-              <w:t>136.382</w:t>
+              <w:t>414.542</w:t>
             </w:r>
           </w:p>
         </w:tc>
@@ -1796,7 +1804,7 @@
                 <w:color w:val="000000"/>
                 <w:sz w:val="16"/>
               </w:rPr>
-              <w:t>0.811</w:t>
+              <w:t>0.887</w:t>
             </w:r>
           </w:p>
         </w:tc>
@@ -1829,7 +1837,7 @@
                 <w:color w:val="000000"/>
                 <w:sz w:val="16"/>
               </w:rPr>
-              <w:t>12.37</w:t>
+              <w:t>18.05</w:t>
             </w:r>
           </w:p>
         </w:tc>
@@ -1933,7 +1941,7 @@
                 <w:color w:val="000000"/>
                 <w:sz w:val="16"/>
               </w:rPr>
-              <w:t>179.531</w:t>
+              <w:t>596.944</w:t>
             </w:r>
           </w:p>
         </w:tc>
@@ -1966,7 +1974,7 @@
                 <w:color w:val="000000"/>
                 <w:sz w:val="16"/>
               </w:rPr>
-              <w:t>0.514</w:t>
+              <w:t>0.670</w:t>
             </w:r>
           </w:p>
         </w:tc>
@@ -1999,7 +2007,7 @@
                 <w:color w:val="000000"/>
                 <w:sz w:val="16"/>
               </w:rPr>
-              <w:t>3.18</w:t>
+              <w:t>4.15</w:t>
             </w:r>
           </w:p>
         </w:tc>
@@ -2057,7 +2065,7 @@
         <w:keepLines w:val="0"/>
       </w:pPr>
       <w:r>
-        <w:t>The fitted full-sample trend is +122 units of exposure per employee per year. The pre-break and post-break estimates are +93 and +136, respectively, and both have high explanatory power. OCC/headcount reached a sample high of 3,563 in 2025 Q1 before falling to 3,387 in 2025 Q4. The 2025 pullback should therefore be read as a moderation from a high level rather than evidence that the long-run trend has reversed.</w:t>
+        <w:t>The fitted full-sample trend is +357 units of quarterly OCC per employee per year. The pre-break and post-break estimates are +290 and +415, respectively, and both have high explanatory power. OCC/headcount reached a sample high of 10,308 in 2025 Q1 and ended 2025 at 10,222. The late-2025 plateau is not evidence that the long-run trend has reversed.</w:t>
       </w:r>
     </w:p>
     <w:p>
@@ -2092,7 +2100,7 @@
           <w:color w:val="17365D"/>
           <w:sz w:val="24"/>
         </w:rPr>
-        <w:t>OCC / headcount  =  (OCC / assets) × (assets / headcount)</w:t>
+        <w:t>Quarterly OCC / headcount  =  (quarterly OCC / average assets) × (average assets / headcount)</w:t>
       </w:r>
     </w:p>
     <w:p>
@@ -2100,7 +2108,7 @@
         <w:keepLines w:val="0"/>
       </w:pPr>
       <w:r>
-        <w:t>From 2011 Q1 to 2025 Q4, assets per employee increased 137.2%, while OCC exposure as a share of assets declined 24.5%. The expansion in assets per employee was large enough to raise OCC exposure per employee by 79.0%. This decomposition is the central economic interpretation of the data.</w:t>
+        <w:t>From 2011 Q1 to 2025 Q4, average assets per employee increased 133.5%, while quarterly OCC as a share of average assets declined 21.3%. The expansion in assets per employee was large enough to raise quarterly OCC per employee by 83.7%. This decomposition is the central economic interpretation of the data.</w:t>
       </w:r>
     </w:p>
     <w:p>
@@ -2111,7 +2119,7 @@
         <w:drawing>
           <wp:inline xmlns:a="http://schemas.openxmlformats.org/drawingml/2006/main" xmlns:pic="http://schemas.openxmlformats.org/drawingml/2006/picture">
             <wp:extent cx="6263640" cy="3062224"/>
-            <wp:docPr id="3" name="Picture 3" descr="Indexed time series showing OCC per employee, assets per employee, and OCC as a share of assets, all set to 100 in 2011 Q1, with a marked 2019 Q1 breakpoint."/>
+            <wp:docPr id="3" name="Picture 3" descr="Indexed time series showing quarterly OCC per employee, average assets per employee, and quarterly OCC as a share of average assets, all set to 100 in 2011 Q1, with a marked 2019 Q1 breakpoint."/>
             <wp:cNvGraphicFramePr>
               <a:graphicFrameLocks noChangeAspect="1"/>
             </wp:cNvGraphicFramePr>
@@ -2153,7 +2161,7 @@
           <w:color w:val="667085"/>
           <w:sz w:val="17"/>
         </w:rPr>
-        <w:t>Figure 3  Indexed decomposition of OCC exposure per employee</w:t>
+        <w:t>Figure 3  Indexed decomposition of quarterly OCC per employee</w:t>
       </w:r>
     </w:p>
     <w:p>
@@ -2161,7 +2169,7 @@
         <w:keepLines w:val="0"/>
       </w:pPr>
       <w:r>
-        <w:t>The full-sample correlation between OCC/assets and OCC/headcount is −0.72, but that negative relationship is mainly a regime effect. Within the pre-2019 and post-2019 periods, the correlations are only 0.19 and 0.08. Since 2023 Q1, however, the two ratios have moved together closely, with a correlation of 0.97. Recent increases in OCC/headcount therefore reflect both a higher OCC share of assets and higher assets per employee.</w:t>
+        <w:t>The full-sample correlation between OCC/assets and OCC/headcount is -0.81, but that negative relationship is mainly a regime effect. Within the pre-2019 and post-2019 periods, the correlations are only 0.04 and -0.12. Since 2023 Q1, however, the two ratios have moved together closely, with a correlation of 0.99. Recent increases in OCC/headcount therefore reflect both a higher OCC share of assets and high assets per employee.</w:t>
       </w:r>
     </w:p>
     <w:p>
@@ -2182,7 +2190,7 @@
         <w:keepLines w:val="0"/>
       </w:pPr>
       <w:r>
-        <w:t>The transition from 2018 Q4 to 2019 Q1 changes the level and interpretation of both series. The simultaneous jumps in assets, OCC exposure, and headcount are consistent with a possible acquisition or consolidation effect. Ratios reduce the scale effect, but they do not remove a potential change in business mix.</w:t>
+        <w:t>The transition from 2018 Q4 to 2019 Q1 changes the level and interpretation of both series. The simultaneous jumps in assets, quarterly OCC, and headcount are consistent with the identified acquisition or consolidation effect. Ratios reduce the scale effect, but they do not remove a potential change in business mix or reporting scope.</w:t>
       </w:r>
     </w:p>
     <w:tbl>
@@ -2373,7 +2381,7 @@
                 <w:color w:val="000000"/>
                 <w:sz w:val="17"/>
               </w:rPr>
-              <w:t>Total assets</w:t>
+              <w:t>Average assets</w:t>
             </w:r>
           </w:p>
         </w:tc>
@@ -2406,7 +2414,7 @@
                 <w:color w:val="000000"/>
                 <w:sz w:val="17"/>
               </w:rPr>
-              <w:t>32.67 bn</w:t>
+              <w:t>32.51 bn</w:t>
             </w:r>
           </w:p>
         </w:tc>
@@ -2439,7 +2447,7 @@
                 <w:color w:val="000000"/>
                 <w:sz w:val="17"/>
               </w:rPr>
-              <w:t>46.63 bn</w:t>
+              <w:t>46.12 bn</w:t>
             </w:r>
           </w:p>
         </w:tc>
@@ -2472,7 +2480,7 @@
                 <w:color w:val="000000"/>
                 <w:sz w:val="17"/>
               </w:rPr>
-              <w:t>+42.7%</w:t>
+              <w:t>+41.9%</w:t>
             </w:r>
           </w:p>
         </w:tc>
@@ -2510,7 +2518,7 @@
                 <w:color w:val="000000"/>
                 <w:sz w:val="17"/>
               </w:rPr>
-              <w:t>OCC exposure</w:t>
+              <w:t>Quarterly OCC sum</w:t>
             </w:r>
           </w:p>
         </w:tc>
@@ -2543,7 +2551,7 @@
                 <w:color w:val="000000"/>
                 <w:sz w:val="17"/>
               </w:rPr>
-              <w:t>11.17 mm</w:t>
+              <w:t>34.26 mm</w:t>
             </w:r>
           </w:p>
         </w:tc>
@@ -2576,7 +2584,7 @@
                 <w:color w:val="000000"/>
                 <w:sz w:val="17"/>
               </w:rPr>
-              <w:t>13.83 mm</w:t>
+              <w:t>38.39 mm</w:t>
             </w:r>
           </w:p>
         </w:tc>
@@ -2609,7 +2617,7 @@
                 <w:color w:val="000000"/>
                 <w:sz w:val="17"/>
               </w:rPr>
-              <w:t>+23.8%</w:t>
+              <w:t>+12.1%</w:t>
             </w:r>
           </w:p>
         </w:tc>
@@ -2784,7 +2792,7 @@
                 <w:color w:val="000000"/>
                 <w:sz w:val="17"/>
               </w:rPr>
-              <w:t>OCC / assets</w:t>
+              <w:t>OCC / average assets</w:t>
             </w:r>
           </w:p>
         </w:tc>
@@ -2817,7 +2825,7 @@
                 <w:color w:val="000000"/>
                 <w:sz w:val="17"/>
               </w:rPr>
-              <w:t>3.42 bps</w:t>
+              <w:t>10.54 bps</w:t>
             </w:r>
           </w:p>
         </w:tc>
@@ -2850,7 +2858,7 @@
                 <w:color w:val="000000"/>
                 <w:sz w:val="17"/>
               </w:rPr>
-              <w:t>2.97 bps</w:t>
+              <w:t>8.32 bps</w:t>
             </w:r>
           </w:p>
         </w:tc>
@@ -2883,7 +2891,7 @@
                 <w:color w:val="000000"/>
                 <w:sz w:val="17"/>
               </w:rPr>
-              <w:t>-13.3%</w:t>
+              <w:t>-21.0%</w:t>
             </w:r>
           </w:p>
         </w:tc>
@@ -2954,7 +2962,7 @@
                 <w:color w:val="000000"/>
                 <w:sz w:val="17"/>
               </w:rPr>
-              <w:t>2,502</w:t>
+              <w:t>7,671</w:t>
             </w:r>
           </w:p>
         </w:tc>
@@ -2987,7 +2995,7 @@
                 <w:color w:val="000000"/>
                 <w:sz w:val="17"/>
               </w:rPr>
-              <w:t>2,674</w:t>
+              <w:t>7,422</w:t>
             </w:r>
           </w:p>
         </w:tc>
@@ -3020,7 +3028,7 @@
                 <w:color w:val="000000"/>
                 <w:sz w:val="17"/>
               </w:rPr>
-              <w:t>+6.9%</w:t>
+              <w:t>-3.3%</w:t>
             </w:r>
           </w:p>
         </w:tc>
@@ -3058,7 +3066,7 @@
                 <w:color w:val="000000"/>
                 <w:sz w:val="17"/>
               </w:rPr>
-              <w:t>Assets / headcount</w:t>
+              <w:t>Average assets / headcount</w:t>
             </w:r>
           </w:p>
         </w:tc>
@@ -3091,7 +3099,7 @@
                 <w:color w:val="000000"/>
                 <w:sz w:val="17"/>
               </w:rPr>
-              <w:t>7.32 mm</w:t>
+              <w:t>7.28 mm</w:t>
             </w:r>
           </w:p>
         </w:tc>
@@ -3124,7 +3132,7 @@
                 <w:color w:val="000000"/>
                 <w:sz w:val="17"/>
               </w:rPr>
-              <w:t>9.01 mm</w:t>
+              <w:t>8.92 mm</w:t>
             </w:r>
           </w:p>
         </w:tc>
@@ -3157,7 +3165,7 @@
                 <w:color w:val="000000"/>
                 <w:sz w:val="17"/>
               </w:rPr>
-              <w:t>+23.2%</w:t>
+              <w:t>+22.5%</w:t>
             </w:r>
           </w:p>
         </w:tc>
@@ -3182,7 +3190,7 @@
         <w:keepLines w:val="0"/>
       </w:pPr>
       <w:r>
-        <w:t>Because assets grew much faster than OCC exposure, OCC/assets fell sharply at the breakpoint. OCC/headcount increased because OCC exposure grew faster than headcount. A trend estimated across the full sample therefore combines three effects: gradual movement within each regime, the 2019 level shift, and changes in business composition.</w:t>
+        <w:t>Because average assets grew much faster than quarterly OCC, OCC/assets fell sharply at the breakpoint. Quarterly OCC also grew more slowly than headcount, so OCC/headcount fell modestly rather than rising. A trend estimated across the full sample therefore combines three effects: movement within each regime, the 2019 level shift, and changes in business composition.</w:t>
       </w:r>
     </w:p>
     <w:p>
@@ -3414,7 +3422,7 @@
                 <w:color w:val="000000"/>
                 <w:sz w:val="17"/>
               </w:rPr>
-              <w:t>2.33</w:t>
+              <w:t>7.50</w:t>
             </w:r>
           </w:p>
         </w:tc>
@@ -3447,7 +3455,7 @@
                 <w:color w:val="000000"/>
                 <w:sz w:val="17"/>
               </w:rPr>
-              <w:t>2,736</w:t>
+              <w:t>8,754</w:t>
             </w:r>
           </w:p>
         </w:tc>
@@ -3480,7 +3488,7 @@
                 <w:color w:val="000000"/>
                 <w:sz w:val="17"/>
               </w:rPr>
-              <w:t>11.73</w:t>
+              <w:t>11.67</w:t>
             </w:r>
           </w:p>
         </w:tc>
@@ -3551,7 +3559,7 @@
                 <w:color w:val="000000"/>
                 <w:sz w:val="17"/>
               </w:rPr>
-              <w:t>2.47</w:t>
+              <w:t>7.51</w:t>
             </w:r>
           </w:p>
         </w:tc>
@@ -3584,7 +3592,7 @@
                 <w:color w:val="000000"/>
                 <w:sz w:val="17"/>
               </w:rPr>
-              <w:t>2,931</w:t>
+              <w:t>8,990</w:t>
             </w:r>
           </w:p>
         </w:tc>
@@ -3617,7 +3625,7 @@
                 <w:color w:val="000000"/>
                 <w:sz w:val="17"/>
               </w:rPr>
-              <w:t>11.88</w:t>
+              <w:t>11.97</w:t>
             </w:r>
           </w:p>
         </w:tc>
@@ -3688,7 +3696,7 @@
                 <w:color w:val="000000"/>
                 <w:sz w:val="17"/>
               </w:rPr>
-              <w:t>2.76</w:t>
+              <w:t>7.98</w:t>
             </w:r>
           </w:p>
         </w:tc>
@@ -3721,7 +3729,7 @@
                 <w:color w:val="000000"/>
                 <w:sz w:val="17"/>
               </w:rPr>
-              <w:t>3,434</w:t>
+              <w:t>10,035</w:t>
             </w:r>
           </w:p>
         </w:tc>
@@ -3754,7 +3762,7 @@
                 <w:color w:val="000000"/>
                 <w:sz w:val="17"/>
               </w:rPr>
-              <w:t>12.47</w:t>
+              <w:t>12.58</w:t>
             </w:r>
           </w:p>
         </w:tc>
@@ -3825,7 +3833,7 @@
                 <w:color w:val="000000"/>
                 <w:sz w:val="17"/>
               </w:rPr>
-              <w:t>2.68</w:t>
+              <w:t>7.85</w:t>
             </w:r>
           </w:p>
         </w:tc>
@@ -3858,7 +3866,7 @@
                 <w:color w:val="000000"/>
                 <w:sz w:val="17"/>
               </w:rPr>
-              <w:t>3,441</w:t>
+              <w:t>10,062</w:t>
             </w:r>
           </w:p>
         </w:tc>
@@ -3891,7 +3899,7 @@
                 <w:color w:val="000000"/>
                 <w:sz w:val="17"/>
               </w:rPr>
-              <w:t>12.83</w:t>
+              <w:t>12.82</w:t>
             </w:r>
           </w:p>
         </w:tc>
@@ -3962,7 +3970,7 @@
                 <w:color w:val="000000"/>
                 <w:sz w:val="17"/>
               </w:rPr>
-              <w:t>2.79</w:t>
+              <w:t>8.08</w:t>
             </w:r>
           </w:p>
         </w:tc>
@@ -3995,7 +4003,7 @@
                 <w:color w:val="000000"/>
                 <w:sz w:val="17"/>
               </w:rPr>
-              <w:t>3,563</w:t>
+              <w:t>10,308</w:t>
             </w:r>
           </w:p>
         </w:tc>
@@ -4028,7 +4036,7 @@
                 <w:color w:val="000000"/>
                 <w:sz w:val="17"/>
               </w:rPr>
-              <w:t>12.78</w:t>
+              <w:t>12.76</w:t>
             </w:r>
           </w:p>
         </w:tc>
@@ -4099,7 +4107,7 @@
                 <w:color w:val="000000"/>
                 <w:sz w:val="17"/>
               </w:rPr>
-              <w:t>2.67</w:t>
+              <w:t>8.03</w:t>
             </w:r>
           </w:p>
         </w:tc>
@@ -4132,7 +4140,7 @@
                 <w:color w:val="000000"/>
                 <w:sz w:val="17"/>
               </w:rPr>
-              <w:t>3,387</w:t>
+              <w:t>10,222</w:t>
             </w:r>
           </w:p>
         </w:tc>
@@ -4165,7 +4173,7 @@
                 <w:color w:val="000000"/>
                 <w:sz w:val="17"/>
               </w:rPr>
-              <w:t>12.68</w:t>
+              <w:t>12.73</w:t>
             </w:r>
           </w:p>
         </w:tc>
@@ -4190,7 +4198,7 @@
         <w:keepLines w:val="0"/>
       </w:pPr>
       <w:r>
-        <w:t>The strongest recent change occurred during 2023. From 2022 Q4 to 2023 Q4, OCC/assets rose about 11.7% and OCC/headcount rose 17.2%. In 2025, both ratios eased from first-quarter highs. This pattern supports continued monitoring but does not yet establish a new downward regime.</w:t>
+        <w:t>The strongest recent change occurred during 2023. From 2022 Q4 to 2023 Q4, OCC/assets rose 6.2% and OCC/headcount rose 11.6%. From 2024 Q4 to 2025 Q4, the ratios changed +2.3% and +1.6%, respectively. The recent pattern supports continued monitoring, but the late-2025 plateau does not establish a new downward regime.</w:t>
       </w:r>
     </w:p>
     <w:p>
@@ -4220,7 +4228,7 @@
         <w:spacing w:after="60"/>
       </w:pPr>
       <w:r>
-        <w:t>OCC/assets measures exposure intensity relative to the balance sheet. It is most useful for assessing whether OCC is becoming a larger or smaller component of total assets.</w:t>
+        <w:t>Quarterly OCC/assets measures three-month OCC activity relative to the average balance sheet. It is useful for assessing whether OCC is becoming more or less intensive relative to assets.</w:t>
       </w:r>
     </w:p>
     <w:p>
@@ -4229,7 +4237,7 @@
         <w:spacing w:after="60"/>
       </w:pPr>
       <w:r>
-        <w:t>OCC/headcount measures exposure supported per employee. It is sensitive to operating leverage, staffing levels, and changes in assets per employee.</w:t>
+        <w:t>Quarterly OCC/headcount measures three-month OCC supported per quarter-end employee. It is sensitive to operating leverage, staffing timing, and changes in assets per employee.</w:t>
       </w:r>
     </w:p>
     <w:p>
@@ -4238,7 +4246,7 @@
         <w:spacing w:after="60"/>
       </w:pPr>
       <w:r>
-        <w:t>Assets/headcount is the bridge between the two ratios. A rise in OCC/headcount does not imply that OCC has become a larger share of assets when assets per employee are rising faster.</w:t>
+        <w:t>Average assets/headcount is the bridge between the two ratios. A rise in OCC/headcount does not imply that OCC has become a larger share of assets when assets per employee are rising faster.</w:t>
       </w:r>
     </w:p>
     <w:p>
@@ -4246,7 +4254,7 @@
         <w:keepLines w:val="0"/>
       </w:pPr>
       <w:r>
-        <w:t>For monitoring, the preferred dashboard should show all three series: OCC/assets, OCC/headcount, and assets/headcount. It should also mark the 2019 Q1 break and avoid fitting one trend line across the entire history without a regime indicator.</w:t>
+        <w:t>For monitoring, the preferred dashboard should show all three series: quarterly OCC/average assets, quarterly OCC/headcount, and average assets/headcount. It should mark the 2019 Q1 break and avoid fitting one trend line across the entire history without a regime indicator. The updated workbook includes full-sample and segmented fits for both ratios.</w:t>
       </w:r>
     </w:p>
     <w:p>
@@ -4280,7 +4288,7 @@
         <w:spacing w:after="60"/>
       </w:pPr>
       <w:r>
-        <w:t>Headcount is observed quarterly and may not equal full-time-equivalent staffing or average staffing during the quarter.</w:t>
+        <w:t>Headcount is observed only at quarter-end. Dividing a three-month OCC sum by quarter-end headcount is a practical intensity measure, but it is not the same as using average full-time-equivalent staffing during the quarter.</w:t>
       </w:r>
     </w:p>
     <w:p>
@@ -4289,7 +4297,7 @@
         <w:spacing w:after="60"/>
       </w:pPr>
       <w:r>
-        <w:t>The trend regressions are descriptive. They do not control for macroeconomic conditions, portfolio mix, seasonality beyond simple quarterly inspection, or changes in OCC definitions.</w:t>
+        <w:t>The trend regressions are descriptive. They do not control for macroeconomic conditions, portfolio mix, formal seasonal effects, or changes in OCC definitions.</w:t>
       </w:r>
     </w:p>
     <w:p>
@@ -4298,7 +4306,16 @@
         <w:spacing w:after="60"/>
       </w:pPr>
       <w:r>
-        <w:t>Using a three-month average asset denominator instead of quarter-end assets changes OCC/assets by only 0.020 basis points on average, with a maximum difference of 0.079 basis points. The main conclusions are therefore insensitive to the asset denominator choice.</w:t>
+        <w:t>Using quarter-end assets instead of three-month average assets changes OCC/assets by 0.059 basis points on average, with a maximum absolute difference of 0.231 basis points in 2012 Q4. The main conclusions are insensitive to the asset denominator choice.</w:t>
+      </w:r>
+    </w:p>
+    <w:p>
+      <w:pPr>
+        <w:pStyle w:val="ListBullet"/>
+        <w:spacing w:after="60"/>
+      </w:pPr>
+      <w:r>
+        <w:t>Quarterly OCC is a three-month sum. It should not be compared directly with a single monthly OCC observation or described as a quarter-end stock.</w:t>
       </w:r>
     </w:p>
     <w:p>
@@ -4314,7 +4331,7 @@
         <w:keepLines w:val="0"/>
       </w:pPr>
       <w:r>
-        <w:t>OCC/headcount has a clear upward long-run trend, while OCC/assets is better characterized by a 2019 level break followed by a relatively flat and recently rising range. The apparent contradiction is explained by the growth in assets per employee. The most useful interpretation is therefore not that OCC exposure has uniformly intensified across the balance sheet, but that each employee now supports materially more assets and OCC exposure than in 2011. The recent rise in both ratios deserves attention, although the easing during 2025 suggests stabilization rather than continued acceleration.</w:t>
+        <w:t>After correcting OCC to a three-month quarterly sum, quarterly OCC/headcount still has a clear upward long-run trend. Quarterly OCC/average assets is better characterized by a sharp 2019 level break, a weak post-break decline, and a recent recovery. The apparent contradiction is explained by growth in average assets per employee. The most useful interpretation is not that OCC has uniformly intensified across the balance sheet, but that each employee now supports materially more assets and quarterly OCC than in 2011. The recent rise in both ratios deserves attention, while the late-2025 plateau suggests stabilization rather than continued acceleration.</w:t>
       </w:r>
     </w:p>
     <w:p>
@@ -4334,7 +4351,7 @@
           <w:color w:val="667085"/>
           <w:sz w:val="17"/>
         </w:rPr>
-        <w:t>Quarterly data supplied in the workbook, Quarterly sheet, 2011 Q1–2025 Q4. OCC is treated as an exposure stock. Calculations use quarter-end assets unless stated otherwise. Values may differ slightly because of rounding.</w:t>
+        <w:t>Monthly OCC and asset data and quarterly headcount supplied in the workbook, 2011 Q1–2025 Q4. Quarterly OCC is the sum of three monthly observations; the preferred asset denominator is the three-month arithmetic average; headcount is quarter-end. Values may differ slightly because of rounding.</w:t>
       </w:r>
     </w:p>
     <w:sectPr>

</xml_diff>